<commit_message>
Adopt matrix v8: AGG Reflation cell re-places leverage (QQQ 1x + ERX 2x tilt)
- matrix.py: MATRIX_VERSION v8; AGG R = QQQ .30 + ERX/GDX/DBC momentum trio; VAGG/MOD/CONS unchanged
- paper_logger.current_allocations(): re-resolves older-version ledger rows from stored signals
  under the current matrix (append-only ledger untouched); manual order tools use it,
  the automated executor reads ledger rows as-is
- orders_workbook --tier; RotationOrders.xlsx regenerated (AGG, v8 restated from Sept signals)
- evidence.json / projection_stats.json / GrowthProjection.xlsx regenerated under v8
  (AGG +24.6% / 1.26 / -34.2%)
- InvestmentSystemOverview.docx AGG row updated; TESTS.md adopted #14; PORTFOLIOS/DEPLOYMENT notes
- 94 tests passing

Co-Authored-By: Claude Fable 5.1 <noreply@anthropic.com>
Claude-Session: https://claude.ai/code/session_01BBnnwzPLx94vYYG3d4vP48
</commit_message>
<xml_diff>
--- a/InvestmentSystemOverview.docx
+++ b/InvestmentSystemOverview.docx
@@ -1082,7 +1082,7 @@
                 <w:sz w:val="19"/>
                 <w:szCs w:val="19"/>
               </w:rPr>
-              <w:t xml:space="preserve">−33%</w:t>
+              <w:t xml:space="preserve">−34%</w:t>
             </w:r>
           </w:p>
         </w:tc>
@@ -1108,7 +1108,7 @@
                 <w:sz w:val="19"/>
                 <w:szCs w:val="19"/>
               </w:rPr>
-              <w:t xml:space="preserve">−$3,340</w:t>
+              <w:t xml:space="preserve">−$3,420</w:t>
             </w:r>
           </w:p>
         </w:tc>
@@ -1649,7 +1649,7 @@
                 <w:sz w:val="19"/>
                 <w:szCs w:val="19"/>
               </w:rPr>
-              <w:t xml:space="preserve">+24.2%</w:t>
+              <w:t xml:space="preserve">+24.6%</w:t>
             </w:r>
           </w:p>
         </w:tc>
@@ -1675,7 +1675,7 @@
                 <w:sz w:val="19"/>
                 <w:szCs w:val="19"/>
               </w:rPr>
-              <w:t xml:space="preserve">−33%</w:t>
+              <w:t xml:space="preserve">−34%</w:t>
             </w:r>
           </w:p>
         </w:tc>
@@ -1701,7 +1701,7 @@
                 <w:sz w:val="19"/>
                 <w:szCs w:val="19"/>
               </w:rPr>
-              <w:t xml:space="preserve">1.23</w:t>
+              <w:t xml:space="preserve">1.26</w:t>
             </w:r>
           </w:p>
         </w:tc>

</xml_diff>

<commit_message>
Entry 73 (ERX by cell: no change), v9 notes, overview document rebuilt in-repo on v9 numbers
Co-Authored-By: Claude Fable 5.1 <noreply@anthropic.com>
Claude-Session: https://claude.ai/code/session_01BBnnwzPLx94vYYG3d4vP48
</commit_message>
<xml_diff>
--- a/InvestmentSystemOverview.docx
+++ b/InvestmentSystemOverview.docx
@@ -33,7 +33,7 @@
           <w:sz w:val="20"/>
           <w:szCs w:val="20"/>
         </w:rPr>
-        <w:t xml:space="preserve">Plain-English overview of the research, the rules, and the results  ·  September 2026</w:t>
+        <w:t xml:space="preserve">Plain-English overview of the research, the rules, and the results  ·  October 2026</w:t>
       </w:r>
     </w:p>
     <w:p>
@@ -68,7 +68,7 @@
           <w:sz w:val="21"/>
           <w:szCs w:val="21"/>
         </w:rPr>
-        <w:t xml:space="preserve">This is a rules-based way of investing that changes what it owns based on the economic “season” the market is in, checked once a month. It is not stock picking and not day trading — it trades about once a month, following written rules, with no predictions and no gut calls. In nineteen years of backtesting (2007–2026), the middle-risk version of the system would have earned about 15% per year while never losing more than about 14% from peak to bottom — a period in which the S&amp;P 500 earned about 11% per year and at one point was down 55%. Higher-risk versions earned more with deeper swings. The same rules were then re-tested on a completely separate twenty-year period (1987–2006) that was never used to design them, and held up. The system went live with real money in September 2026, and every month’s decision is logged in advance in a public record that cannot be edited after the fact — so results are graded honestly, going forward, against a benchmark that cannot be fudged.</w:t>
+        <w:t xml:space="preserve">This is a rules-based way of investing that changes what it owns based on the economic “season” the market is in, checked once a month. It is not stock picking and not day trading — it trades about once a month, following written rules, with no predictions and no gut calls. In nearly twenty years of backtesting (2007–2026), the middle-risk version of the system would have earned about 15% per year while never losing more than about 14% from peak to bottom — a period in which the S&amp;P 500 earned about 11% per year and at one point was down 55%. Higher-risk versions earned more with deeper swings. The same rules were then re-tested on a completely separate twenty-year period (1987–2006) that was never used to design them, and held up. The system went live with real money in September 2026, and every month’s decision is logged in advance in a public record that cannot be edited after the fact — so results are graded honestly, going forward, against a benchmark that cannot be fudged.</w:t>
       </w:r>
     </w:p>
     <w:p>
@@ -603,7 +603,7 @@
                 <w:sz w:val="19"/>
                 <w:szCs w:val="19"/>
               </w:rPr>
-              <w:t xml:space="preserve">Government bonds and gold; a small bet against oil</w:t>
+              <w:t xml:space="preserve">Government bonds and gold (gold miners in the aggressive versions); a small bet against oil</w:t>
             </w:r>
           </w:p>
         </w:tc>
@@ -629,7 +629,7 @@
           <w:sz w:val="21"/>
           <w:szCs w:val="21"/>
         </w:rPr>
-        <w:t xml:space="preserve">That is the whole engine. The month’s season is decided from finished data (no peeking), the matching list is bought, and nothing else happens until the next month-end. Along the way we tested dozens of “improvements” — checking the signals daily or weekly, reacting to news, credit-market warnings, volatility signals, buying dips — and rejected more than thirty of them because they failed a simple honesty test: an idea only counts if it worked in BOTH the modern period (2007–2026) and a separate earlier period (1987–2006). Thirteen ideas passed that bar and are in the system; everything else was written down and discarded. Trading costs and taxes are included in the planning numbers.</w:t>
+        <w:t xml:space="preserve">That is the whole engine. The month’s season is decided from finished data (no peeking), the matching list is bought, and nothing else happens until the next month-end. Along the way we tested dozens of “improvements” — checking the signals daily or weekly, reacting to news, credit-market warnings, volatility signals, buying dips — and rejected more than thirty of them because they failed a simple honesty test: an idea only counts if it worked in BOTH the modern period (2007–2026) and a separate earlier period (1987–2006). Fifteen ideas passed that bar and are in the system; everything else was written down and discarded. Trading costs and taxes are included in the planning numbers.</w:t>
       </w:r>
     </w:p>
     <w:p>
@@ -1082,7 +1082,7 @@
                 <w:sz w:val="19"/>
                 <w:szCs w:val="19"/>
               </w:rPr>
-              <w:t xml:space="preserve">−34%</w:t>
+              <w:t xml:space="preserve">−33%</w:t>
             </w:r>
           </w:p>
         </w:tc>
@@ -1108,7 +1108,7 @@
                 <w:sz w:val="19"/>
                 <w:szCs w:val="19"/>
               </w:rPr>
-              <w:t xml:space="preserve">−$3,420</w:t>
+              <w:t xml:space="preserve">−$3,310</w:t>
             </w:r>
           </w:p>
         </w:tc>
@@ -1214,7 +1214,7 @@
                 <w:sz w:val="19"/>
                 <w:szCs w:val="19"/>
               </w:rPr>
-              <w:t xml:space="preserve">−$4,700</w:t>
+              <w:t xml:space="preserve">−$4,680</w:t>
             </w:r>
           </w:p>
         </w:tc>
@@ -1257,7 +1257,7 @@
           <w:sz w:val="26"/>
           <w:szCs w:val="26"/>
         </w:rPr>
-        <w:t xml:space="preserve">The return profile (19-year backtest, 2007–2026)</w:t>
+        <w:t xml:space="preserve">The return profile (backtest, Jan 2007–Sep 2026)</w:t>
       </w:r>
     </w:p>
     <w:tbl>
@@ -1437,7 +1437,7 @@
                 <w:sz w:val="19"/>
                 <w:szCs w:val="19"/>
               </w:rPr>
-              <w:t xml:space="preserve">+9.7%</w:t>
+              <w:t xml:space="preserve">+9.8%</w:t>
             </w:r>
           </w:p>
         </w:tc>
@@ -1489,7 +1489,7 @@
                 <w:sz w:val="19"/>
                 <w:szCs w:val="19"/>
               </w:rPr>
-              <w:t xml:space="preserve">1.60</w:t>
+              <w:t xml:space="preserve">1.62</w:t>
             </w:r>
           </w:p>
         </w:tc>
@@ -1543,7 +1543,7 @@
                 <w:sz w:val="19"/>
                 <w:szCs w:val="19"/>
               </w:rPr>
-              <w:t xml:space="preserve">+15.3%</w:t>
+              <w:t xml:space="preserve">+15.4%</w:t>
             </w:r>
           </w:p>
         </w:tc>
@@ -1595,7 +1595,7 @@
                 <w:sz w:val="19"/>
                 <w:szCs w:val="19"/>
               </w:rPr>
-              <w:t xml:space="preserve">1.72</w:t>
+              <w:t xml:space="preserve">1.73</w:t>
             </w:r>
           </w:p>
         </w:tc>
@@ -1649,7 +1649,7 @@
                 <w:sz w:val="19"/>
                 <w:szCs w:val="19"/>
               </w:rPr>
-              <w:t xml:space="preserve">+24.6%</w:t>
+              <w:t xml:space="preserve">+27.3%</w:t>
             </w:r>
           </w:p>
         </w:tc>
@@ -1675,7 +1675,7 @@
                 <w:sz w:val="19"/>
                 <w:szCs w:val="19"/>
               </w:rPr>
-              <w:t xml:space="preserve">−34%</w:t>
+              <w:t xml:space="preserve">−33%</w:t>
             </w:r>
           </w:p>
         </w:tc>
@@ -1701,7 +1701,7 @@
                 <w:sz w:val="19"/>
                 <w:szCs w:val="19"/>
               </w:rPr>
-              <w:t xml:space="preserve">1.26</w:t>
+              <w:t xml:space="preserve">1.41</w:t>
             </w:r>
           </w:p>
         </w:tc>
@@ -1755,7 +1755,7 @@
                 <w:sz w:val="19"/>
                 <w:szCs w:val="19"/>
               </w:rPr>
-              <w:t xml:space="preserve">+32.4%</w:t>
+              <w:t xml:space="preserve">+35.3%</w:t>
             </w:r>
           </w:p>
         </w:tc>
@@ -1807,7 +1807,7 @@
                 <w:sz w:val="19"/>
                 <w:szCs w:val="19"/>
               </w:rPr>
-              <w:t xml:space="preserve">1.11</w:t>
+              <w:t xml:space="preserve">1.22</w:t>
             </w:r>
           </w:p>
         </w:tc>
@@ -1861,7 +1861,7 @@
                 <w:sz w:val="19"/>
                 <w:szCs w:val="19"/>
               </w:rPr>
-              <w:t xml:space="preserve">+10.8%</w:t>
+              <w:t xml:space="preserve">+11.0%</w:t>
             </w:r>
           </w:p>
         </w:tc>
@@ -1913,7 +1913,7 @@
                 <w:sz w:val="19"/>
                 <w:szCs w:val="19"/>
               </w:rPr>
-              <w:t xml:space="preserve">0.67</w:t>
+              <w:t xml:space="preserve">0.69</w:t>
             </w:r>
           </w:p>
         </w:tc>
@@ -1967,7 +1967,7 @@
                 <w:sz w:val="19"/>
                 <w:szCs w:val="19"/>
               </w:rPr>
-              <w:t xml:space="preserve">+16.3%</w:t>
+              <w:t xml:space="preserve">+16.4%</w:t>
             </w:r>
           </w:p>
         </w:tc>
@@ -2019,7 +2019,7 @@
                 <w:sz w:val="19"/>
                 <w:szCs w:val="19"/>
               </w:rPr>
-              <w:t xml:space="preserve">0.94</w:t>
+              <w:t xml:space="preserve">0.96</w:t>
             </w:r>
           </w:p>
         </w:tc>
@@ -2396,7 +2396,7 @@
                 <w:sz w:val="19"/>
                 <w:szCs w:val="19"/>
               </w:rPr>
-              <w:t xml:space="preserve">+40%</w:t>
+              <w:t xml:space="preserve">+44%</w:t>
             </w:r>
           </w:p>
         </w:tc>
@@ -2528,7 +2528,7 @@
                 <w:sz w:val="19"/>
                 <w:szCs w:val="19"/>
               </w:rPr>
-              <w:t xml:space="preserve">+115%</w:t>
+              <w:t xml:space="preserve">+140%</w:t>
             </w:r>
           </w:p>
         </w:tc>
@@ -2660,7 +2660,7 @@
                 <w:sz w:val="19"/>
                 <w:szCs w:val="19"/>
               </w:rPr>
-              <w:t xml:space="preserve">−34%</w:t>
+              <w:t xml:space="preserve">−31%</w:t>
             </w:r>
           </w:p>
         </w:tc>
@@ -2792,7 +2792,7 @@
                 <w:sz w:val="19"/>
                 <w:szCs w:val="19"/>
               </w:rPr>
-              <w:t xml:space="preserve">+60%</w:t>
+              <w:t xml:space="preserve">+50%</w:t>
             </w:r>
           </w:p>
         </w:tc>
@@ -2820,7 +2820,7 @@
                 <w:sz w:val="19"/>
                 <w:szCs w:val="19"/>
               </w:rPr>
-              <w:t xml:space="preserve">2026 (to Aug)</w:t>
+              <w:t xml:space="preserve">2026 (to Sep)</w:t>
             </w:r>
           </w:p>
         </w:tc>
@@ -2898,7 +2898,7 @@
                 <w:sz w:val="19"/>
                 <w:szCs w:val="19"/>
               </w:rPr>
-              <w:t xml:space="preserve">+18%</w:t>
+              <w:t xml:space="preserve">+20%</w:t>
             </w:r>
           </w:p>
         </w:tc>
@@ -2924,7 +2924,7 @@
                 <w:sz w:val="19"/>
                 <w:szCs w:val="19"/>
               </w:rPr>
-              <w:t xml:space="preserve">+37%</w:t>
+              <w:t xml:space="preserve">+33%</w:t>
             </w:r>
           </w:p>
         </w:tc>
@@ -2950,7 +2950,7 @@
           <w:sz w:val="21"/>
           <w:szCs w:val="21"/>
         </w:rPr>
-        <w:t xml:space="preserve">The pattern to notice: in 2008 the system sat in bonds and gold while the index lost a third — that is the season signal doing its job. 2022 shows the honest limit: when inflation broke stocks and bonds at the same time, the leveraged version still lost 34% (the index lost 18%). The system reduces how often you get hurt; it does not make losing years impossible. And the 2020 leveraged figure (+115%) leans on simulated leverage math in a wild year — treat it as the backtest’s best case, not its base case.</w:t>
+        <w:t xml:space="preserve">The pattern to notice: in 2008 the system sat in bonds and gold while the index lost a third — that is the season signal doing its job. 2022 shows the honest limit: when inflation broke stocks and bonds at the same time, the leveraged version still lost 31% (the index lost 18%). The system reduces how often you get hurt; it does not make losing years impossible. And the 2020 leveraged figure (+140%) leans on simulated leverage math and gold miners in a wild year — treat it as the backtest’s best case, not its base case.</w:t>
       </w:r>
     </w:p>
     <w:p>
@@ -3018,7 +3018,7 @@
           <w:sz w:val="21"/>
           <w:szCs w:val="21"/>
         </w:rPr>
-        <w:t xml:space="preserve">The drops are real. The aggressive versions have backtested drops of 33–47%, and the out-of-sample period showed a 66% drop for the highest tier. If you would sell in a panic partway down, the drop table — not the return table — is your table.</w:t>
+        <w:t xml:space="preserve">The drops are real. The aggressive versions have backtested drops of 33–47%, and the out-of-sample period showed a 60% drop for the highest tier. If you would sell in a panic partway down, the drop table — not the return table — is your table.</w:t>
       </w:r>
     </w:p>
     <w:p>
@@ -3146,10 +3146,6 @@
 </w:document>
 </file>
 
-<file path=word/comments.xml><?xml version="1.0" encoding="utf-8"?>
-<w:comments xmlns:cx="http://schemas.microsoft.com/office/drawing/2014/chartex" xmlns:cx1="http://schemas.microsoft.com/office/drawing/2015/9/8/chartex" xmlns:cx2="http://schemas.microsoft.com/office/drawing/2015/10/21/chartex" xmlns:cx3="http://schemas.microsoft.com/office/drawing/2016/5/9/chartex" xmlns:cx4="http://schemas.microsoft.com/office/drawing/2016/5/10/chartex" xmlns:cx5="http://schemas.microsoft.com/office/drawing/2016/5/11/chartex" xmlns:cx6="http://schemas.microsoft.com/office/drawing/2016/5/12/chartex" xmlns:cx7="http://schemas.microsoft.com/office/drawing/2016/5/13/chartex" xmlns:cx8="http://schemas.microsoft.com/office/drawing/2016/5/14/chartex" xmlns:mc="http://schemas.openxmlformats.org/markup-compatibility/2006" xmlns:aink="http://schemas.microsoft.com/office/drawing/2016/ink" xmlns:am3d="http://schemas.microsoft.com/office/drawing/2017/model3d" xmlns:o="urn:schemas-microsoft-com:office:office" xmlns:r="http://schemas.openxmlformats.org/officeDocument/2006/relationships" xmlns:m="http://schemas.openxmlformats.org/officeDocument/2006/math" xmlns:v="urn:schemas-microsoft-com:vml" xmlns:wp14="http://schemas.microsoft.com/office/word/2010/wordprocessingDrawing" xmlns:wp="http://schemas.openxmlformats.org/drawingml/2006/wordprocessingDrawing" xmlns:w10="urn:schemas-microsoft-com:office:word" xmlns:w="http://schemas.openxmlformats.org/wordprocessingml/2006/main" xmlns:w14="http://schemas.microsoft.com/office/word/2010/wordml" xmlns:w15="http://schemas.microsoft.com/office/word/2012/wordml" xmlns:w16cex="http://schemas.microsoft.com/office/word/2018/wordml/cex" xmlns:w16cid="http://schemas.microsoft.com/office/word/2016/wordml/cid" xmlns:w16="http://schemas.microsoft.com/office/word/2018/wordml" xmlns:w16sdtdh="http://schemas.microsoft.com/office/word/2020/wordml/sdtdatahash" xmlns:w16se="http://schemas.microsoft.com/office/word/2015/wordml/symex" xmlns:wpg="http://schemas.microsoft.com/office/word/2010/wordprocessingGroup" xmlns:wpi="http://schemas.microsoft.com/office/word/2010/wordprocessingInk" xmlns:wne="http://schemas.microsoft.com/office/word/2006/wordml" xmlns:wps="http://schemas.microsoft.com/office/word/2010/wordprocessingShape"/>
-</file>
-
 <file path=word/endnotes.xml><?xml version="1.0" encoding="utf-8"?>
 <w:endnotes xmlns:wpc="http://schemas.microsoft.com/office/word/2010/wordprocessingCanvas" xmlns:mc="http://schemas.openxmlformats.org/markup-compatibility/2006" xmlns:o="urn:schemas-microsoft-com:office:office" xmlns:r="http://schemas.openxmlformats.org/officeDocument/2006/relationships" xmlns:m="http://schemas.openxmlformats.org/officeDocument/2006/math" xmlns:v="urn:schemas-microsoft-com:vml" xmlns:wp14="http://schemas.microsoft.com/office/word/2010/wordprocessingDrawing" xmlns:wp="http://schemas.openxmlformats.org/drawingml/2006/wordprocessingDrawing" xmlns:w10="urn:schemas-microsoft-com:office:word" xmlns:w="http://schemas.openxmlformats.org/wordprocessingml/2006/main" xmlns:w14="http://schemas.microsoft.com/office/word/2010/wordml" xmlns:w15="http://schemas.microsoft.com/office/word/2012/wordml" xmlns:wpg="http://schemas.microsoft.com/office/word/2010/wordprocessingGroup" xmlns:wpi="http://schemas.microsoft.com/office/word/2010/wordprocessingInk" xmlns:wne="http://schemas.microsoft.com/office/word/2006/wordml" xmlns:wps="http://schemas.microsoft.com/office/word/2010/wordprocessingShape" mc:Ignorable="w14 w15 wp14">
   <w:endnote w:type="separator" w:id="-1">
@@ -3228,7 +3224,7 @@
 <w:numbering xmlns:wpc="http://schemas.microsoft.com/office/word/2010/wordprocessingCanvas" xmlns:mc="http://schemas.openxmlformats.org/markup-compatibility/2006" xmlns:o="urn:schemas-microsoft-com:office:office" xmlns:r="http://schemas.openxmlformats.org/officeDocument/2006/relationships" xmlns:m="http://schemas.openxmlformats.org/officeDocument/2006/math" xmlns:v="urn:schemas-microsoft-com:vml" xmlns:wp14="http://schemas.microsoft.com/office/word/2010/wordprocessingDrawing" xmlns:wp="http://schemas.openxmlformats.org/drawingml/2006/wordprocessingDrawing" xmlns:w10="urn:schemas-microsoft-com:office:word" xmlns:w="http://schemas.openxmlformats.org/wordprocessingml/2006/main" xmlns:w14="http://schemas.microsoft.com/office/word/2010/wordml" xmlns:w15="http://schemas.microsoft.com/office/word/2012/wordml" xmlns:wpg="http://schemas.microsoft.com/office/word/2010/wordprocessingGroup" xmlns:wpi="http://schemas.microsoft.com/office/word/2010/wordprocessingInk" xmlns:wne="http://schemas.microsoft.com/office/word/2006/wordml" xmlns:wps="http://schemas.microsoft.com/office/word/2010/wordprocessingShape" mc:Ignorable="w14 w15 wp14">
   <w:abstractNum w:abstractNumId="1" w15:restartNumberingAfterBreak="0">
     <w:multiLevelType w:val="hybridMultilevel"/>
-    <w:lvl w:ilvl="0" w15:tentative="1">
+    <w:lvl w:ilvl="0" w:tentative="1">
       <w:start w:val="1"/>
       <w:numFmt w:val="bullet"/>
       <w:lvlText w:val="●"/>
@@ -3237,7 +3233,7 @@
         <w:ind w:left="720" w:hanging="360"/>
       </w:pPr>
     </w:lvl>
-    <w:lvl w:ilvl="1" w15:tentative="1">
+    <w:lvl w:ilvl="1" w:tentative="1">
       <w:start w:val="1"/>
       <w:numFmt w:val="bullet"/>
       <w:lvlText w:val="○"/>
@@ -3246,7 +3242,7 @@
         <w:ind w:left="1440" w:hanging="360"/>
       </w:pPr>
     </w:lvl>
-    <w:lvl w:ilvl="2" w15:tentative="1">
+    <w:lvl w:ilvl="2" w:tentative="1">
       <w:start w:val="1"/>
       <w:numFmt w:val="bullet"/>
       <w:lvlText w:val="■"/>
@@ -3255,7 +3251,7 @@
         <w:ind w:left="2160" w:hanging="360"/>
       </w:pPr>
     </w:lvl>
-    <w:lvl w:ilvl="3" w15:tentative="1">
+    <w:lvl w:ilvl="3" w:tentative="1">
       <w:start w:val="1"/>
       <w:numFmt w:val="bullet"/>
       <w:lvlText w:val="●"/>
@@ -3264,7 +3260,7 @@
         <w:ind w:left="2880" w:hanging="360"/>
       </w:pPr>
     </w:lvl>
-    <w:lvl w:ilvl="4" w15:tentative="1">
+    <w:lvl w:ilvl="4" w:tentative="1">
       <w:start w:val="1"/>
       <w:numFmt w:val="bullet"/>
       <w:lvlText w:val="○"/>
@@ -3273,7 +3269,7 @@
         <w:ind w:left="3600" w:hanging="360"/>
       </w:pPr>
     </w:lvl>
-    <w:lvl w:ilvl="5" w15:tentative="1">
+    <w:lvl w:ilvl="5" w:tentative="1">
       <w:start w:val="1"/>
       <w:numFmt w:val="bullet"/>
       <w:lvlText w:val="■"/>
@@ -3282,7 +3278,7 @@
         <w:ind w:left="4320" w:hanging="360"/>
       </w:pPr>
     </w:lvl>
-    <w:lvl w:ilvl="6" w15:tentative="1">
+    <w:lvl w:ilvl="6" w:tentative="1">
       <w:start w:val="1"/>
       <w:numFmt w:val="bullet"/>
       <w:lvlText w:val="●"/>
@@ -3291,7 +3287,7 @@
         <w:ind w:left="5040" w:hanging="360"/>
       </w:pPr>
     </w:lvl>
-    <w:lvl w:ilvl="7" w15:tentative="1">
+    <w:lvl w:ilvl="7" w:tentative="1">
       <w:start w:val="1"/>
       <w:numFmt w:val="bullet"/>
       <w:lvlText w:val="●"/>
@@ -3300,7 +3296,7 @@
         <w:ind w:left="5760" w:hanging="360"/>
       </w:pPr>
     </w:lvl>
-    <w:lvl w:ilvl="8" w15:tentative="1">
+    <w:lvl w:ilvl="8" w:tentative="1">
       <w:start w:val="1"/>
       <w:numFmt w:val="bullet"/>
       <w:lvlText w:val="●"/>
@@ -3312,7 +3308,7 @@
   </w:abstractNum>
   <w:abstractNum w:abstractNumId="2" w15:restartNumberingAfterBreak="0">
     <w:multiLevelType w:val="hybridMultilevel"/>
-    <w:lvl w:ilvl="0" w15:tentative="1">
+    <w:lvl w:ilvl="0" w:tentative="1">
       <w:start w:val="1"/>
       <w:numFmt w:val="bullet"/>
       <w:lvlText w:val="•"/>
@@ -3343,6 +3339,25 @@
     <w:rPrDefault/>
     <w:pPrDefault/>
   </w:docDefaults>
+  <w:style w:type="paragraph" w:styleId="Normal" w:default="1">
+    <w:name w:val="Normal"/>
+    <w:qFormat/>
+  </w:style>
+  <w:style w:type="table" w:styleId="TableNormal" w:default="true">
+    <w:name w:val="Normal Table"/>
+    <w:uiPriority w:val="99"/>
+    <w:semiHidden/>
+    <w:unhideWhenUsed/>
+    <w:tblPr>
+      <w:tblInd w:type="dxa" w:w="0"/>
+      <w:tblCellMar>
+        <w:top w:type="dxa" w:w="0"/>
+        <w:left w:type="dxa" w:w="108"/>
+        <w:bottom w:type="dxa" w:w="0"/>
+        <w:right w:type="dxa" w:w="108"/>
+      </w:tblCellMar>
+    </w:tblPr>
+  </w:style>
   <w:style w:type="paragraph" w:styleId="Title">
     <w:name w:val="Title"/>
     <w:basedOn w:val="Normal"/>
@@ -3515,4 +3530,294 @@
     </w:rPr>
   </w:style>
 </w:styles>
+</file>
+
+<file path=word/theme/theme1.xml><?xml version="1.0" encoding="utf-8"?>
+<a:theme xmlns:a="http://schemas.openxmlformats.org/drawingml/2006/main" name="Office Theme">
+  <a:themeElements>
+    <a:clrScheme name="Office">
+      <a:dk1>
+        <a:sysClr val="windowText" lastClr="000000"/>
+      </a:dk1>
+      <a:lt1>
+        <a:sysClr val="window" lastClr="FFFFFF"/>
+      </a:lt1>
+      <a:dk2>
+        <a:srgbClr val="44546A"/>
+      </a:dk2>
+      <a:lt2>
+        <a:srgbClr val="E7E6E6"/>
+      </a:lt2>
+      <a:accent1>
+        <a:srgbClr val="4472C4"/>
+      </a:accent1>
+      <a:accent2>
+        <a:srgbClr val="ED7D31"/>
+      </a:accent2>
+      <a:accent3>
+        <a:srgbClr val="A5A5A5"/>
+      </a:accent3>
+      <a:accent4>
+        <a:srgbClr val="FFC000"/>
+      </a:accent4>
+      <a:accent5>
+        <a:srgbClr val="5B9BD5"/>
+      </a:accent5>
+      <a:accent6>
+        <a:srgbClr val="70AD47"/>
+      </a:accent6>
+      <a:hlink>
+        <a:srgbClr val="0563C1"/>
+      </a:hlink>
+      <a:folHlink>
+        <a:srgbClr val="954F72"/>
+      </a:folHlink>
+    </a:clrScheme>
+    <a:fontScheme name="Office">
+      <a:majorFont>
+        <a:latin typeface="Calibri Light" panose="020F0302020204030204"/>
+        <a:ea typeface=""/>
+        <a:cs typeface=""/>
+        <a:font script="Jpan" typeface="游ゴシック Light"/>
+        <a:font script="Hang" typeface="맑은 고딕"/>
+        <a:font script="Hans" typeface="等线 Light"/>
+        <a:font script="Hant" typeface="新細明體"/>
+        <a:font script="Arab" typeface="Times New Roman"/>
+        <a:font script="Hebr" typeface="Times New Roman"/>
+        <a:font script="Thai" typeface="Angsana New"/>
+        <a:font script="Ethi" typeface="Nyala"/>
+        <a:font script="Beng" typeface="Vrinda"/>
+        <a:font script="Gujr" typeface="Shruti"/>
+        <a:font script="Khmr" typeface="MoolBoran"/>
+        <a:font script="Knda" typeface="Tunga"/>
+        <a:font script="Guru" typeface="Raavi"/>
+        <a:font script="Cans" typeface="Euphemia"/>
+        <a:font script="Cher" typeface="Plantagenet Cherokee"/>
+        <a:font script="Yiii" typeface="Microsoft Yi Baiti"/>
+        <a:font script="Tibt" typeface="Microsoft Himalaya"/>
+        <a:font script="Thaa" typeface="MV Boli"/>
+        <a:font script="Deva" typeface="Mangal"/>
+        <a:font script="Telu" typeface="Gautami"/>
+        <a:font script="Taml" typeface="Latha"/>
+        <a:font script="Syrc" typeface="Estrangelo Edessa"/>
+        <a:font script="Orya" typeface="Kalinga"/>
+        <a:font script="Mlym" typeface="Kartika"/>
+        <a:font script="Laoo" typeface="DokChampa"/>
+        <a:font script="Sinh" typeface="Iskoola Pota"/>
+        <a:font script="Mong" typeface="Mongolian Baiti"/>
+        <a:font script="Viet" typeface="Times New Roman"/>
+        <a:font script="Uigh" typeface="Microsoft Uighur"/>
+        <a:font script="Geor" typeface="Sylfaen"/>
+        <a:font script="Armn" typeface="Arial"/>
+        <a:font script="Bugi" typeface="Leelawadee UI"/>
+        <a:font script="Bopo" typeface="Microsoft JhengHei"/>
+        <a:font script="Java" typeface="Javanese Text"/>
+        <a:font script="Lisu" typeface="Segoe UI"/>
+        <a:font script="Mymr" typeface="Myanmar Text"/>
+        <a:font script="Nkoo" typeface="Ebrima"/>
+        <a:font script="Olck" typeface="Nirmala UI"/>
+        <a:font script="Osma" typeface="Ebrima"/>
+        <a:font script="Phag" typeface="Phagspa"/>
+        <a:font script="Syrn" typeface="Estrangelo Edessa"/>
+        <a:font script="Syrj" typeface="Estrangelo Edessa"/>
+        <a:font script="Syre" typeface="Estrangelo Edessa"/>
+        <a:font script="Sora" typeface="Nirmala UI"/>
+        <a:font script="Tale" typeface="Microsoft Tai Le"/>
+        <a:font script="Talu" typeface="Microsoft New Tai Lue"/>
+        <a:font script="Tfng" typeface="Ebrima"/>
+      </a:majorFont>
+      <a:minorFont>
+        <a:latin typeface="Calibri" panose="020F0502020204030204"/>
+        <a:ea typeface=""/>
+        <a:cs typeface=""/>
+        <a:font script="Jpan" typeface="游明朝"/>
+        <a:font script="Hang" typeface="맑은 고딕"/>
+        <a:font script="Hans" typeface="等线"/>
+        <a:font script="Hant" typeface="新細明體"/>
+        <a:font script="Arab" typeface="Arial"/>
+        <a:font script="Hebr" typeface="Arial"/>
+        <a:font script="Thai" typeface="Cordia New"/>
+        <a:font script="Ethi" typeface="Nyala"/>
+        <a:font script="Beng" typeface="Vrinda"/>
+        <a:font script="Gujr" typeface="Shruti"/>
+        <a:font script="Khmr" typeface="DaunPenh"/>
+        <a:font script="Knda" typeface="Tunga"/>
+        <a:font script="Guru" typeface="Raavi"/>
+        <a:font script="Cans" typeface="Euphemia"/>
+        <a:font script="Cher" typeface="Plantagenet Cherokee"/>
+        <a:font script="Yiii" typeface="Microsoft Yi Baiti"/>
+        <a:font script="Tibt" typeface="Microsoft Himalaya"/>
+        <a:font script="Thaa" typeface="MV Boli"/>
+        <a:font script="Deva" typeface="Mangal"/>
+        <a:font script="Telu" typeface="Gautami"/>
+        <a:font script="Taml" typeface="Latha"/>
+        <a:font script="Syrc" typeface="Estrangelo Edessa"/>
+        <a:font script="Orya" typeface="Kalinga"/>
+        <a:font script="Mlym" typeface="Kartika"/>
+        <a:font script="Laoo" typeface="DokChampa"/>
+        <a:font script="Sinh" typeface="Iskoola Pota"/>
+        <a:font script="Mong" typeface="Mongolian Baiti"/>
+        <a:font script="Viet" typeface="Arial"/>
+        <a:font script="Uigh" typeface="Microsoft Uighur"/>
+        <a:font script="Geor" typeface="Sylfaen"/>
+        <a:font script="Armn" typeface="Arial"/>
+        <a:font script="Bugi" typeface="Leelawadee UI"/>
+        <a:font script="Bopo" typeface="Microsoft JhengHei"/>
+        <a:font script="Java" typeface="Javanese Text"/>
+        <a:font script="Lisu" typeface="Segoe UI"/>
+        <a:font script="Mymr" typeface="Myanmar Text"/>
+        <a:font script="Nkoo" typeface="Ebrima"/>
+        <a:font script="Olck" typeface="Nirmala UI"/>
+        <a:font script="Osma" typeface="Ebrima"/>
+        <a:font script="Phag" typeface="Phagspa"/>
+        <a:font script="Syrn" typeface="Estrangelo Edessa"/>
+        <a:font script="Syrj" typeface="Estrangelo Edessa"/>
+        <a:font script="Syre" typeface="Estrangelo Edessa"/>
+        <a:font script="Sora" typeface="Nirmala UI"/>
+        <a:font script="Tale" typeface="Microsoft Tai Le"/>
+        <a:font script="Talu" typeface="Microsoft New Tai Lue"/>
+        <a:font script="Tfng" typeface="Ebrima"/>
+      </a:minorFont>
+    </a:fontScheme>
+    <a:fmtScheme name="Office">
+      <a:fillStyleLst>
+        <a:solidFill>
+          <a:schemeClr val="phClr"/>
+        </a:solidFill>
+        <a:gradFill rotWithShape="true">
+          <a:gsLst>
+            <a:gs pos="0">
+              <a:schemeClr val="phClr">
+                <a:lumMod val="110000"/>
+                <a:satMod val="105000"/>
+                <a:tint val="67000"/>
+              </a:schemeClr>
+            </a:gs>
+            <a:gs pos="50000">
+              <a:schemeClr val="phClr">
+                <a:lumMod val="105000"/>
+                <a:satMod val="103000"/>
+                <a:tint val="73000"/>
+              </a:schemeClr>
+            </a:gs>
+            <a:gs pos="100000">
+              <a:schemeClr val="phClr">
+                <a:lumMod val="105000"/>
+                <a:satMod val="109000"/>
+                <a:tint val="81000"/>
+              </a:schemeClr>
+            </a:gs>
+          </a:gsLst>
+          <a:lin ang="5400000" scaled="false"/>
+        </a:gradFill>
+        <a:gradFill rotWithShape="true">
+          <a:gsLst>
+            <a:gs pos="0">
+              <a:schemeClr val="phClr">
+                <a:satMod val="103000"/>
+                <a:lumMod val="102000"/>
+                <a:tint val="94000"/>
+              </a:schemeClr>
+            </a:gs>
+            <a:gs pos="50000">
+              <a:schemeClr val="phClr">
+                <a:satMod val="110000"/>
+                <a:lumMod val="100000"/>
+                <a:shade val="100000"/>
+              </a:schemeClr>
+            </a:gs>
+            <a:gs pos="100000">
+              <a:schemeClr val="phClr">
+                <a:lumMod val="99000"/>
+                <a:satMod val="120000"/>
+                <a:shade val="78000"/>
+              </a:schemeClr>
+            </a:gs>
+          </a:gsLst>
+          <a:lin ang="5400000" scaled="false"/>
+        </a:gradFill>
+      </a:fillStyleLst>
+      <a:lnStyleLst>
+        <a:ln w="6350" cap="flat" cmpd="sng" algn="ctr">
+          <a:solidFill>
+            <a:schemeClr val="phClr"/>
+          </a:solidFill>
+          <a:prstDash val="solid"/>
+          <a:miter lim="800000"/>
+        </a:ln>
+        <a:ln w="12700" cap="flat" cmpd="sng" algn="ctr">
+          <a:solidFill>
+            <a:schemeClr val="phClr"/>
+          </a:solidFill>
+          <a:prstDash val="solid"/>
+          <a:miter lim="800000"/>
+        </a:ln>
+        <a:ln w="19050" cap="flat" cmpd="sng" algn="ctr">
+          <a:solidFill>
+            <a:schemeClr val="phClr"/>
+          </a:solidFill>
+          <a:prstDash val="solid"/>
+          <a:miter lim="800000"/>
+        </a:ln>
+      </a:lnStyleLst>
+      <a:effectStyleLst>
+        <a:effectStyle>
+          <a:effectLst/>
+        </a:effectStyle>
+        <a:effectStyle>
+          <a:effectLst/>
+        </a:effectStyle>
+        <a:effectStyle>
+          <a:effectLst>
+            <a:outerShdw blurRad="57150" dist="19050" dir="5400000" algn="ctr" rotWithShape="false">
+              <a:srgbClr val="000000">
+                <a:alpha val="63000"/>
+              </a:srgbClr>
+            </a:outerShdw>
+          </a:effectLst>
+        </a:effectStyle>
+      </a:effectStyleLst>
+      <a:bgFillStyleLst>
+        <a:solidFill>
+          <a:schemeClr val="phClr"/>
+        </a:solidFill>
+        <a:solidFill>
+          <a:schemeClr val="phClr">
+            <a:tint val="95000"/>
+            <a:satMod val="170000"/>
+          </a:schemeClr>
+        </a:solidFill>
+        <a:gradFill rotWithShape="true">
+          <a:gsLst>
+            <a:gs pos="0">
+              <a:schemeClr val="phClr">
+                <a:tint val="93000"/>
+                <a:satMod val="150000"/>
+                <a:shade val="98000"/>
+                <a:lumMod val="102000"/>
+              </a:schemeClr>
+            </a:gs>
+            <a:gs pos="50000">
+              <a:schemeClr val="phClr">
+                <a:tint val="98000"/>
+                <a:satMod val="130000"/>
+                <a:shade val="90000"/>
+                <a:lumMod val="103000"/>
+              </a:schemeClr>
+            </a:gs>
+            <a:gs pos="100000">
+              <a:schemeClr val="phClr">
+                <a:shade val="63000"/>
+                <a:satMod val="120000"/>
+              </a:schemeClr>
+            </a:gs>
+          </a:gsLst>
+          <a:lin ang="5400000" scaled="false"/>
+        </a:gradFill>
+      </a:bgFillStyleLst>
+    </a:fmtScheme>
+  </a:themeElements>
+  <a:objectDefaults/>
+  <a:extraClrSchemeLst/>
+</a:theme>
 </file>
</xml_diff>